<commit_message>
Fix dashboard view navigation bug, mobile layout overflow, rate limit verification in tests
</commit_message>
<xml_diff>
--- a/Project_Report.docx
+++ b/Project_Report.docx
@@ -6,8 +6,6 @@
       <w:pPr>
         <w:jc w:val="center"/>
       </w:pPr>
-      <w:bookmarkStart w:id="28" w:name="_GoBack"/>
-      <w:bookmarkEnd w:id="28"/>
       <w:r>
         <w:rPr>
           <w:b/>
@@ -91,7 +89,17 @@
           <w:color w:val="1D4ED8"/>
           <w:sz w:val="26"/>
         </w:rPr>
-        <w:t>Module 4 — Live GPS Tracking, Telematics Backend &amp; Dashboard</w:t>
+        <w:t xml:space="preserve"> </w:t>
+      </w:r>
+      <w:bookmarkStart w:id="28" w:name="_GoBack"/>
+      <w:bookmarkEnd w:id="28"/>
+      <w:r>
+        <w:rPr>
+          <w:i/>
+          <w:color w:val="1D4ED8"/>
+          <w:sz w:val="26"/>
+        </w:rPr>
+        <w:t xml:space="preserve"> Live GPS Tracking, Telematics Backend &amp; Dashboard</w:t>
       </w:r>
     </w:p>
     <w:p/>
@@ -3306,12 +3314,6 @@
             <w:insideH w:val="single" w:color="4F81BD" w:themeColor="accent1" w:sz="8" w:space="0"/>
             <w:insideV w:val="single" w:color="4F81BD" w:themeColor="accent1" w:sz="8" w:space="0"/>
           </w:tblBorders>
-          <w:tblCellMar>
-            <w:top w:w="0" w:type="dxa"/>
-            <w:left w:w="108" w:type="dxa"/>
-            <w:bottom w:w="0" w:type="dxa"/>
-            <w:right w:w="108" w:type="dxa"/>
-          </w:tblCellMar>
         </w:tblPrEx>
         <w:trPr>
           <w:jc w:val="center"/>
@@ -7181,7 +7183,7 @@
     <w:lsdException w:uiPriority="99" w:name="index 8"/>
     <w:lsdException w:uiPriority="99" w:name="index 9"/>
     <w:lsdException w:uiPriority="39" w:name="toc 1"/>
-    <w:lsdException w:uiPriority="39" w:name="toc 2"/>
+    <w:lsdException w:qFormat="1" w:uiPriority="39" w:name="toc 2"/>
     <w:lsdException w:uiPriority="39" w:name="toc 3"/>
     <w:lsdException w:uiPriority="39" w:name="toc 4"/>
     <w:lsdException w:uiPriority="39" w:name="toc 5"/>
@@ -7206,21 +7208,21 @@
     <w:lsdException w:uiPriority="99" w:name="endnote reference"/>
     <w:lsdException w:uiPriority="99" w:name="endnote text"/>
     <w:lsdException w:uiPriority="99" w:name="table of authorities"/>
-    <w:lsdException w:uiPriority="99" w:semiHidden="0" w:name="macro"/>
+    <w:lsdException w:qFormat="1" w:uiPriority="99" w:semiHidden="0" w:name="macro"/>
     <w:lsdException w:uiPriority="99" w:name="toa heading"/>
-    <w:lsdException w:uiPriority="99" w:semiHidden="0" w:name="List"/>
+    <w:lsdException w:qFormat="1" w:uiPriority="99" w:semiHidden="0" w:name="List"/>
     <w:lsdException w:uiPriority="99" w:semiHidden="0" w:name="List Bullet"/>
     <w:lsdException w:uiPriority="99" w:semiHidden="0" w:name="List Number"/>
-    <w:lsdException w:uiPriority="99" w:semiHidden="0" w:name="List 2"/>
-    <w:lsdException w:uiPriority="99" w:semiHidden="0" w:name="List 3"/>
+    <w:lsdException w:qFormat="1" w:uiPriority="99" w:semiHidden="0" w:name="List 2"/>
+    <w:lsdException w:qFormat="1" w:uiPriority="99" w:semiHidden="0" w:name="List 3"/>
     <w:lsdException w:uiPriority="99" w:name="List 4"/>
     <w:lsdException w:uiPriority="99" w:name="List 5"/>
-    <w:lsdException w:uiPriority="99" w:semiHidden="0" w:name="List Bullet 2"/>
+    <w:lsdException w:qFormat="1" w:uiPriority="99" w:semiHidden="0" w:name="List Bullet 2"/>
     <w:lsdException w:uiPriority="99" w:semiHidden="0" w:name="List Bullet 3"/>
     <w:lsdException w:uiPriority="99" w:name="List Bullet 4"/>
     <w:lsdException w:uiPriority="99" w:name="List Bullet 5"/>
-    <w:lsdException w:uiPriority="99" w:semiHidden="0" w:name="List Number 2"/>
-    <w:lsdException w:uiPriority="99" w:semiHidden="0" w:name="List Number 3"/>
+    <w:lsdException w:qFormat="1" w:uiPriority="99" w:semiHidden="0" w:name="List Number 2"/>
+    <w:lsdException w:qFormat="1" w:uiPriority="99" w:semiHidden="0" w:name="List Number 3"/>
     <w:lsdException w:uiPriority="99" w:name="List Number 4"/>
     <w:lsdException w:uiPriority="99" w:name="List Number 5"/>
     <w:lsdException w:qFormat="1" w:unhideWhenUsed="0" w:uiPriority="10" w:semiHidden="0" w:name="Title"/>
@@ -7231,7 +7233,7 @@
     <w:lsdException w:uiPriority="99" w:name="Body Text Indent"/>
     <w:lsdException w:uiPriority="99" w:semiHidden="0" w:name="List Continue"/>
     <w:lsdException w:uiPriority="99" w:semiHidden="0" w:name="List Continue 2"/>
-    <w:lsdException w:uiPriority="99" w:semiHidden="0" w:name="List Continue 3"/>
+    <w:lsdException w:qFormat="1" w:uiPriority="99" w:semiHidden="0" w:name="List Continue 3"/>
     <w:lsdException w:uiPriority="99" w:name="List Continue 4"/>
     <w:lsdException w:uiPriority="99" w:name="List Continue 5"/>
     <w:lsdException w:uiPriority="99" w:name="Message Header"/>
@@ -7241,8 +7243,8 @@
     <w:lsdException w:uiPriority="99" w:name="Body Text First Indent"/>
     <w:lsdException w:uiPriority="99" w:name="Body Text First Indent 2"/>
     <w:lsdException w:uiPriority="99" w:name="Note Heading"/>
-    <w:lsdException w:uiPriority="99" w:semiHidden="0" w:name="Body Text 2"/>
-    <w:lsdException w:uiPriority="99" w:semiHidden="0" w:name="Body Text 3"/>
+    <w:lsdException w:qFormat="1" w:uiPriority="99" w:semiHidden="0" w:name="Body Text 2"/>
+    <w:lsdException w:qFormat="1" w:uiPriority="99" w:semiHidden="0" w:name="Body Text 3"/>
     <w:lsdException w:uiPriority="99" w:name="Body Text Indent 2"/>
     <w:lsdException w:uiPriority="99" w:name="Body Text Indent 3"/>
     <w:lsdException w:uiPriority="99" w:name="Block Text"/>
@@ -7264,7 +7266,7 @@
     <w:lsdException w:uiPriority="99" w:name="HTML Sample"/>
     <w:lsdException w:uiPriority="99" w:name="HTML Typewriter"/>
     <w:lsdException w:uiPriority="99" w:name="HTML Variable"/>
-    <w:lsdException w:uiPriority="99" w:name="Normal Table"/>
+    <w:lsdException w:qFormat="1" w:uiPriority="99" w:name="Normal Table"/>
     <w:lsdException w:uiPriority="99" w:name="annotation subject"/>
     <w:lsdException w:uiPriority="99" w:name="Table Simple 1"/>
     <w:lsdException w:uiPriority="99" w:name="Table Simple 2"/>
@@ -7309,25 +7311,25 @@
     <w:lsdException w:uiPriority="99" w:name="Table Web 2"/>
     <w:lsdException w:uiPriority="99" w:name="Table Web 3"/>
     <w:lsdException w:uiPriority="99" w:name="Balloon Text"/>
-    <w:lsdException w:unhideWhenUsed="0" w:uiPriority="59" w:semiHidden="0" w:name="Table Grid"/>
+    <w:lsdException w:qFormat="1" w:unhideWhenUsed="0" w:uiPriority="59" w:semiHidden="0" w:name="Table Grid"/>
     <w:lsdException w:uiPriority="99" w:name="Table Theme"/>
     <w:lsdException w:qFormat="1" w:unhideWhenUsed="0" w:uiPriority="1" w:semiHidden="0" w:name="No Spacing"/>
-    <w:lsdException w:unhideWhenUsed="0" w:uiPriority="60" w:semiHidden="0" w:name="Light Shading"/>
-    <w:lsdException w:unhideWhenUsed="0" w:uiPriority="61" w:semiHidden="0" w:name="Light List"/>
-    <w:lsdException w:unhideWhenUsed="0" w:uiPriority="62" w:semiHidden="0" w:name="Light Grid"/>
+    <w:lsdException w:qFormat="1" w:unhideWhenUsed="0" w:uiPriority="60" w:semiHidden="0" w:name="Light Shading"/>
+    <w:lsdException w:qFormat="1" w:unhideWhenUsed="0" w:uiPriority="61" w:semiHidden="0" w:name="Light List"/>
+    <w:lsdException w:qFormat="1" w:unhideWhenUsed="0" w:uiPriority="62" w:semiHidden="0" w:name="Light Grid"/>
     <w:lsdException w:unhideWhenUsed="0" w:uiPriority="63" w:semiHidden="0" w:name="Medium Shading 1"/>
     <w:lsdException w:unhideWhenUsed="0" w:uiPriority="64" w:semiHidden="0" w:name="Medium Shading 2"/>
     <w:lsdException w:unhideWhenUsed="0" w:uiPriority="65" w:semiHidden="0" w:name="Medium List 1"/>
-    <w:lsdException w:unhideWhenUsed="0" w:uiPriority="66" w:semiHidden="0" w:name="Medium List 2"/>
+    <w:lsdException w:qFormat="1" w:unhideWhenUsed="0" w:uiPriority="66" w:semiHidden="0" w:name="Medium List 2"/>
     <w:lsdException w:unhideWhenUsed="0" w:uiPriority="67" w:semiHidden="0" w:name="Medium Grid 1"/>
-    <w:lsdException w:unhideWhenUsed="0" w:uiPriority="68" w:semiHidden="0" w:name="Medium Grid 2"/>
-    <w:lsdException w:unhideWhenUsed="0" w:uiPriority="69" w:semiHidden="0" w:name="Medium Grid 3"/>
-    <w:lsdException w:unhideWhenUsed="0" w:uiPriority="70" w:semiHidden="0" w:name="Dark List"/>
-    <w:lsdException w:unhideWhenUsed="0" w:uiPriority="71" w:semiHidden="0" w:name="Colorful Shading"/>
-    <w:lsdException w:unhideWhenUsed="0" w:uiPriority="72" w:semiHidden="0" w:name="Colorful List"/>
-    <w:lsdException w:unhideWhenUsed="0" w:uiPriority="73" w:semiHidden="0" w:name="Colorful Grid"/>
+    <w:lsdException w:qFormat="1" w:unhideWhenUsed="0" w:uiPriority="68" w:semiHidden="0" w:name="Medium Grid 2"/>
+    <w:lsdException w:qFormat="1" w:unhideWhenUsed="0" w:uiPriority="69" w:semiHidden="0" w:name="Medium Grid 3"/>
+    <w:lsdException w:qFormat="1" w:unhideWhenUsed="0" w:uiPriority="70" w:semiHidden="0" w:name="Dark List"/>
+    <w:lsdException w:qFormat="1" w:unhideWhenUsed="0" w:uiPriority="71" w:semiHidden="0" w:name="Colorful Shading"/>
+    <w:lsdException w:qFormat="1" w:unhideWhenUsed="0" w:uiPriority="72" w:semiHidden="0" w:name="Colorful List"/>
+    <w:lsdException w:qFormat="1" w:unhideWhenUsed="0" w:uiPriority="73" w:semiHidden="0" w:name="Colorful Grid"/>
     <w:lsdException w:unhideWhenUsed="0" w:uiPriority="60" w:semiHidden="0" w:name="Light Shading Accent 1"/>
-    <w:lsdException w:unhideWhenUsed="0" w:uiPriority="61" w:semiHidden="0" w:name="Light List Accent 1"/>
+    <w:lsdException w:qFormat="1" w:unhideWhenUsed="0" w:uiPriority="61" w:semiHidden="0" w:name="Light List Accent 1"/>
     <w:lsdException w:unhideWhenUsed="0" w:uiPriority="62" w:semiHidden="0" w:name="Light Grid Accent 1"/>
     <w:lsdException w:unhideWhenUsed="0" w:uiPriority="63" w:semiHidden="0" w:name="Medium Shading 1 Accent 1"/>
     <w:lsdException w:unhideWhenUsed="0" w:uiPriority="64" w:semiHidden="0" w:name="Medium Shading 2 Accent 1"/>
@@ -7338,81 +7340,81 @@
     <w:lsdException w:unhideWhenUsed="0" w:uiPriority="66" w:semiHidden="0" w:name="Medium List 2 Accent 1"/>
     <w:lsdException w:unhideWhenUsed="0" w:uiPriority="67" w:semiHidden="0" w:name="Medium Grid 1 Accent 1"/>
     <w:lsdException w:unhideWhenUsed="0" w:uiPriority="68" w:semiHidden="0" w:name="Medium Grid 2 Accent 1"/>
-    <w:lsdException w:unhideWhenUsed="0" w:uiPriority="69" w:semiHidden="0" w:name="Medium Grid 3 Accent 1"/>
-    <w:lsdException w:unhideWhenUsed="0" w:uiPriority="70" w:semiHidden="0" w:name="Dark List Accent 1"/>
-    <w:lsdException w:unhideWhenUsed="0" w:uiPriority="71" w:semiHidden="0" w:name="Colorful Shading Accent 1"/>
-    <w:lsdException w:unhideWhenUsed="0" w:uiPriority="72" w:semiHidden="0" w:name="Colorful List Accent 1"/>
-    <w:lsdException w:unhideWhenUsed="0" w:uiPriority="73" w:semiHidden="0" w:name="Colorful Grid Accent 1"/>
+    <w:lsdException w:qFormat="1" w:unhideWhenUsed="0" w:uiPriority="69" w:semiHidden="0" w:name="Medium Grid 3 Accent 1"/>
+    <w:lsdException w:qFormat="1" w:unhideWhenUsed="0" w:uiPriority="70" w:semiHidden="0" w:name="Dark List Accent 1"/>
+    <w:lsdException w:qFormat="1" w:unhideWhenUsed="0" w:uiPriority="71" w:semiHidden="0" w:name="Colorful Shading Accent 1"/>
+    <w:lsdException w:qFormat="1" w:unhideWhenUsed="0" w:uiPriority="72" w:semiHidden="0" w:name="Colorful List Accent 1"/>
+    <w:lsdException w:qFormat="1" w:unhideWhenUsed="0" w:uiPriority="73" w:semiHidden="0" w:name="Colorful Grid Accent 1"/>
     <w:lsdException w:unhideWhenUsed="0" w:uiPriority="60" w:semiHidden="0" w:name="Light Shading Accent 2"/>
     <w:lsdException w:unhideWhenUsed="0" w:uiPriority="61" w:semiHidden="0" w:name="Light List Accent 2"/>
-    <w:lsdException w:unhideWhenUsed="0" w:uiPriority="62" w:semiHidden="0" w:name="Light Grid Accent 2"/>
+    <w:lsdException w:qFormat="1" w:unhideWhenUsed="0" w:uiPriority="62" w:semiHidden="0" w:name="Light Grid Accent 2"/>
     <w:lsdException w:unhideWhenUsed="0" w:uiPriority="63" w:semiHidden="0" w:name="Medium Shading 1 Accent 2"/>
     <w:lsdException w:unhideWhenUsed="0" w:uiPriority="64" w:semiHidden="0" w:name="Medium Shading 2 Accent 2"/>
-    <w:lsdException w:unhideWhenUsed="0" w:uiPriority="65" w:semiHidden="0" w:name="Medium List 1 Accent 2"/>
-    <w:lsdException w:unhideWhenUsed="0" w:uiPriority="66" w:semiHidden="0" w:name="Medium List 2 Accent 2"/>
+    <w:lsdException w:qFormat="1" w:unhideWhenUsed="0" w:uiPriority="65" w:semiHidden="0" w:name="Medium List 1 Accent 2"/>
+    <w:lsdException w:qFormat="1" w:unhideWhenUsed="0" w:uiPriority="66" w:semiHidden="0" w:name="Medium List 2 Accent 2"/>
     <w:lsdException w:unhideWhenUsed="0" w:uiPriority="67" w:semiHidden="0" w:name="Medium Grid 1 Accent 2"/>
-    <w:lsdException w:unhideWhenUsed="0" w:uiPriority="68" w:semiHidden="0" w:name="Medium Grid 2 Accent 2"/>
-    <w:lsdException w:unhideWhenUsed="0" w:uiPriority="69" w:semiHidden="0" w:name="Medium Grid 3 Accent 2"/>
-    <w:lsdException w:unhideWhenUsed="0" w:uiPriority="70" w:semiHidden="0" w:name="Dark List Accent 2"/>
-    <w:lsdException w:unhideWhenUsed="0" w:uiPriority="71" w:semiHidden="0" w:name="Colorful Shading Accent 2"/>
+    <w:lsdException w:qFormat="1" w:unhideWhenUsed="0" w:uiPriority="68" w:semiHidden="0" w:name="Medium Grid 2 Accent 2"/>
+    <w:lsdException w:qFormat="1" w:unhideWhenUsed="0" w:uiPriority="69" w:semiHidden="0" w:name="Medium Grid 3 Accent 2"/>
+    <w:lsdException w:qFormat="1" w:unhideWhenUsed="0" w:uiPriority="70" w:semiHidden="0" w:name="Dark List Accent 2"/>
+    <w:lsdException w:qFormat="1" w:unhideWhenUsed="0" w:uiPriority="71" w:semiHidden="0" w:name="Colorful Shading Accent 2"/>
     <w:lsdException w:unhideWhenUsed="0" w:uiPriority="72" w:semiHidden="0" w:name="Colorful List Accent 2"/>
-    <w:lsdException w:unhideWhenUsed="0" w:uiPriority="73" w:semiHidden="0" w:name="Colorful Grid Accent 2"/>
+    <w:lsdException w:qFormat="1" w:unhideWhenUsed="0" w:uiPriority="73" w:semiHidden="0" w:name="Colorful Grid Accent 2"/>
     <w:lsdException w:qFormat="1" w:unhideWhenUsed="0" w:uiPriority="60" w:semiHidden="0" w:name="Light Shading Accent 3"/>
     <w:lsdException w:unhideWhenUsed="0" w:uiPriority="61" w:semiHidden="0" w:name="Light List Accent 3"/>
     <w:lsdException w:unhideWhenUsed="0" w:uiPriority="62" w:semiHidden="0" w:name="Light Grid Accent 3"/>
     <w:lsdException w:unhideWhenUsed="0" w:uiPriority="63" w:semiHidden="0" w:name="Medium Shading 1 Accent 3"/>
     <w:lsdException w:unhideWhenUsed="0" w:uiPriority="64" w:semiHidden="0" w:name="Medium Shading 2 Accent 3"/>
-    <w:lsdException w:unhideWhenUsed="0" w:uiPriority="65" w:semiHidden="0" w:name="Medium List 1 Accent 3"/>
+    <w:lsdException w:qFormat="1" w:unhideWhenUsed="0" w:uiPriority="65" w:semiHidden="0" w:name="Medium List 1 Accent 3"/>
     <w:lsdException w:unhideWhenUsed="0" w:uiPriority="66" w:semiHidden="0" w:name="Medium List 2 Accent 3"/>
     <w:lsdException w:unhideWhenUsed="0" w:uiPriority="67" w:semiHidden="0" w:name="Medium Grid 1 Accent 3"/>
     <w:lsdException w:unhideWhenUsed="0" w:uiPriority="68" w:semiHidden="0" w:name="Medium Grid 2 Accent 3"/>
-    <w:lsdException w:unhideWhenUsed="0" w:uiPriority="69" w:semiHidden="0" w:name="Medium Grid 3 Accent 3"/>
-    <w:lsdException w:unhideWhenUsed="0" w:uiPriority="70" w:semiHidden="0" w:name="Dark List Accent 3"/>
-    <w:lsdException w:unhideWhenUsed="0" w:uiPriority="71" w:semiHidden="0" w:name="Colorful Shading Accent 3"/>
-    <w:lsdException w:unhideWhenUsed="0" w:uiPriority="72" w:semiHidden="0" w:name="Colorful List Accent 3"/>
-    <w:lsdException w:unhideWhenUsed="0" w:uiPriority="73" w:semiHidden="0" w:name="Colorful Grid Accent 3"/>
-    <w:lsdException w:unhideWhenUsed="0" w:uiPriority="60" w:semiHidden="0" w:name="Light Shading Accent 4"/>
-    <w:lsdException w:unhideWhenUsed="0" w:uiPriority="61" w:semiHidden="0" w:name="Light List Accent 4"/>
+    <w:lsdException w:qFormat="1" w:unhideWhenUsed="0" w:uiPriority="69" w:semiHidden="0" w:name="Medium Grid 3 Accent 3"/>
+    <w:lsdException w:qFormat="1" w:unhideWhenUsed="0" w:uiPriority="70" w:semiHidden="0" w:name="Dark List Accent 3"/>
+    <w:lsdException w:qFormat="1" w:unhideWhenUsed="0" w:uiPriority="71" w:semiHidden="0" w:name="Colorful Shading Accent 3"/>
+    <w:lsdException w:qFormat="1" w:unhideWhenUsed="0" w:uiPriority="72" w:semiHidden="0" w:name="Colorful List Accent 3"/>
+    <w:lsdException w:qFormat="1" w:unhideWhenUsed="0" w:uiPriority="73" w:semiHidden="0" w:name="Colorful Grid Accent 3"/>
+    <w:lsdException w:qFormat="1" w:unhideWhenUsed="0" w:uiPriority="60" w:semiHidden="0" w:name="Light Shading Accent 4"/>
+    <w:lsdException w:qFormat="1" w:unhideWhenUsed="0" w:uiPriority="61" w:semiHidden="0" w:name="Light List Accent 4"/>
     <w:lsdException w:unhideWhenUsed="0" w:uiPriority="62" w:semiHidden="0" w:name="Light Grid Accent 4"/>
-    <w:lsdException w:unhideWhenUsed="0" w:uiPriority="63" w:semiHidden="0" w:name="Medium Shading 1 Accent 4"/>
+    <w:lsdException w:qFormat="1" w:unhideWhenUsed="0" w:uiPriority="63" w:semiHidden="0" w:name="Medium Shading 1 Accent 4"/>
     <w:lsdException w:unhideWhenUsed="0" w:uiPriority="64" w:semiHidden="0" w:name="Medium Shading 2 Accent 4"/>
     <w:lsdException w:unhideWhenUsed="0" w:uiPriority="65" w:semiHidden="0" w:name="Medium List 1 Accent 4"/>
     <w:lsdException w:unhideWhenUsed="0" w:uiPriority="66" w:semiHidden="0" w:name="Medium List 2 Accent 4"/>
-    <w:lsdException w:unhideWhenUsed="0" w:uiPriority="67" w:semiHidden="0" w:name="Medium Grid 1 Accent 4"/>
+    <w:lsdException w:qFormat="1" w:unhideWhenUsed="0" w:uiPriority="67" w:semiHidden="0" w:name="Medium Grid 1 Accent 4"/>
     <w:lsdException w:unhideWhenUsed="0" w:uiPriority="68" w:semiHidden="0" w:name="Medium Grid 2 Accent 4"/>
-    <w:lsdException w:unhideWhenUsed="0" w:uiPriority="69" w:semiHidden="0" w:name="Medium Grid 3 Accent 4"/>
-    <w:lsdException w:unhideWhenUsed="0" w:uiPriority="70" w:semiHidden="0" w:name="Dark List Accent 4"/>
-    <w:lsdException w:unhideWhenUsed="0" w:uiPriority="71" w:semiHidden="0" w:name="Colorful Shading Accent 4"/>
-    <w:lsdException w:unhideWhenUsed="0" w:uiPriority="72" w:semiHidden="0" w:name="Colorful List Accent 4"/>
+    <w:lsdException w:qFormat="1" w:unhideWhenUsed="0" w:uiPriority="69" w:semiHidden="0" w:name="Medium Grid 3 Accent 4"/>
+    <w:lsdException w:qFormat="1" w:unhideWhenUsed="0" w:uiPriority="70" w:semiHidden="0" w:name="Dark List Accent 4"/>
+    <w:lsdException w:qFormat="1" w:unhideWhenUsed="0" w:uiPriority="71" w:semiHidden="0" w:name="Colorful Shading Accent 4"/>
+    <w:lsdException w:qFormat="1" w:unhideWhenUsed="0" w:uiPriority="72" w:semiHidden="0" w:name="Colorful List Accent 4"/>
     <w:lsdException w:unhideWhenUsed="0" w:uiPriority="73" w:semiHidden="0" w:name="Colorful Grid Accent 4"/>
-    <w:lsdException w:unhideWhenUsed="0" w:uiPriority="60" w:semiHidden="0" w:name="Light Shading Accent 5"/>
-    <w:lsdException w:unhideWhenUsed="0" w:uiPriority="61" w:semiHidden="0" w:name="Light List Accent 5"/>
+    <w:lsdException w:qFormat="1" w:unhideWhenUsed="0" w:uiPriority="60" w:semiHidden="0" w:name="Light Shading Accent 5"/>
+    <w:lsdException w:qFormat="1" w:unhideWhenUsed="0" w:uiPriority="61" w:semiHidden="0" w:name="Light List Accent 5"/>
     <w:lsdException w:unhideWhenUsed="0" w:uiPriority="62" w:semiHidden="0" w:name="Light Grid Accent 5"/>
     <w:lsdException w:unhideWhenUsed="0" w:uiPriority="63" w:semiHidden="0" w:name="Medium Shading 1 Accent 5"/>
     <w:lsdException w:unhideWhenUsed="0" w:uiPriority="64" w:semiHidden="0" w:name="Medium Shading 2 Accent 5"/>
     <w:lsdException w:unhideWhenUsed="0" w:uiPriority="65" w:semiHidden="0" w:name="Medium List 1 Accent 5"/>
     <w:lsdException w:unhideWhenUsed="0" w:uiPriority="66" w:semiHidden="0" w:name="Medium List 2 Accent 5"/>
     <w:lsdException w:unhideWhenUsed="0" w:uiPriority="67" w:semiHidden="0" w:name="Medium Grid 1 Accent 5"/>
-    <w:lsdException w:unhideWhenUsed="0" w:uiPriority="68" w:semiHidden="0" w:name="Medium Grid 2 Accent 5"/>
-    <w:lsdException w:unhideWhenUsed="0" w:uiPriority="69" w:semiHidden="0" w:name="Medium Grid 3 Accent 5"/>
-    <w:lsdException w:unhideWhenUsed="0" w:uiPriority="70" w:semiHidden="0" w:name="Dark List Accent 5"/>
+    <w:lsdException w:qFormat="1" w:unhideWhenUsed="0" w:uiPriority="68" w:semiHidden="0" w:name="Medium Grid 2 Accent 5"/>
+    <w:lsdException w:qFormat="1" w:unhideWhenUsed="0" w:uiPriority="69" w:semiHidden="0" w:name="Medium Grid 3 Accent 5"/>
+    <w:lsdException w:qFormat="1" w:unhideWhenUsed="0" w:uiPriority="70" w:semiHidden="0" w:name="Dark List Accent 5"/>
     <w:lsdException w:unhideWhenUsed="0" w:uiPriority="71" w:semiHidden="0" w:name="Colorful Shading Accent 5"/>
-    <w:lsdException w:unhideWhenUsed="0" w:uiPriority="72" w:semiHidden="0" w:name="Colorful List Accent 5"/>
+    <w:lsdException w:qFormat="1" w:unhideWhenUsed="0" w:uiPriority="72" w:semiHidden="0" w:name="Colorful List Accent 5"/>
     <w:lsdException w:unhideWhenUsed="0" w:uiPriority="73" w:semiHidden="0" w:name="Colorful Grid Accent 5"/>
     <w:lsdException w:unhideWhenUsed="0" w:uiPriority="60" w:semiHidden="0" w:name="Light Shading Accent 6"/>
     <w:lsdException w:unhideWhenUsed="0" w:uiPriority="61" w:semiHidden="0" w:name="Light List Accent 6"/>
-    <w:lsdException w:unhideWhenUsed="0" w:uiPriority="62" w:semiHidden="0" w:name="Light Grid Accent 6"/>
+    <w:lsdException w:qFormat="1" w:unhideWhenUsed="0" w:uiPriority="62" w:semiHidden="0" w:name="Light Grid Accent 6"/>
     <w:lsdException w:unhideWhenUsed="0" w:uiPriority="63" w:semiHidden="0" w:name="Medium Shading 1 Accent 6"/>
     <w:lsdException w:unhideWhenUsed="0" w:uiPriority="64" w:semiHidden="0" w:name="Medium Shading 2 Accent 6"/>
     <w:lsdException w:unhideWhenUsed="0" w:uiPriority="65" w:semiHidden="0" w:name="Medium List 1 Accent 6"/>
     <w:lsdException w:unhideWhenUsed="0" w:uiPriority="66" w:semiHidden="0" w:name="Medium List 2 Accent 6"/>
     <w:lsdException w:unhideWhenUsed="0" w:uiPriority="67" w:semiHidden="0" w:name="Medium Grid 1 Accent 6"/>
     <w:lsdException w:unhideWhenUsed="0" w:uiPriority="68" w:semiHidden="0" w:name="Medium Grid 2 Accent 6"/>
-    <w:lsdException w:unhideWhenUsed="0" w:uiPriority="69" w:semiHidden="0" w:name="Medium Grid 3 Accent 6"/>
-    <w:lsdException w:unhideWhenUsed="0" w:uiPriority="70" w:semiHidden="0" w:name="Dark List Accent 6"/>
+    <w:lsdException w:qFormat="1" w:unhideWhenUsed="0" w:uiPriority="69" w:semiHidden="0" w:name="Medium Grid 3 Accent 6"/>
+    <w:lsdException w:qFormat="1" w:unhideWhenUsed="0" w:uiPriority="70" w:semiHidden="0" w:name="Dark List Accent 6"/>
     <w:lsdException w:unhideWhenUsed="0" w:uiPriority="71" w:semiHidden="0" w:name="Colorful Shading Accent 6"/>
-    <w:lsdException w:unhideWhenUsed="0" w:uiPriority="72" w:semiHidden="0" w:name="Colorful List Accent 6"/>
-    <w:lsdException w:unhideWhenUsed="0" w:uiPriority="73" w:semiHidden="0" w:name="Colorful Grid Accent 6"/>
+    <w:lsdException w:qFormat="1" w:unhideWhenUsed="0" w:uiPriority="72" w:semiHidden="0" w:name="Colorful List Accent 6"/>
+    <w:lsdException w:qFormat="1" w:unhideWhenUsed="0" w:uiPriority="73" w:semiHidden="0" w:name="Colorful Grid Accent 6"/>
   </w:latentStyles>
   <w:style w:type="paragraph" w:default="1" w:styleId="1">
     <w:name w:val="Normal"/>
@@ -7666,6 +7668,7 @@
     <w:name w:val="Normal Table"/>
     <w:semiHidden/>
     <w:unhideWhenUsed/>
+    <w:qFormat/>
     <w:uiPriority w:val="99"/>
     <w:tblPr>
       <w:tblCellMar>
@@ -7691,6 +7694,7 @@
     <w:basedOn w:val="1"/>
     <w:link w:val="147"/>
     <w:unhideWhenUsed/>
+    <w:qFormat/>
     <w:uiPriority w:val="99"/>
     <w:pPr>
       <w:spacing w:after="120" w:line="480" w:lineRule="auto"/>
@@ -7701,6 +7705,7 @@
     <w:basedOn w:val="1"/>
     <w:link w:val="148"/>
     <w:unhideWhenUsed/>
+    <w:qFormat/>
     <w:uiPriority w:val="99"/>
     <w:pPr>
       <w:spacing w:after="120"/>
@@ -7778,6 +7783,7 @@
     <w:name w:val="List"/>
     <w:basedOn w:val="1"/>
     <w:unhideWhenUsed/>
+    <w:qFormat/>
     <w:uiPriority w:val="99"/>
     <w:pPr>
       <w:ind w:left="360" w:hanging="360"/>
@@ -7788,6 +7794,7 @@
     <w:name w:val="List 2"/>
     <w:basedOn w:val="1"/>
     <w:unhideWhenUsed/>
+    <w:qFormat/>
     <w:uiPriority w:val="99"/>
     <w:pPr>
       <w:ind w:left="720" w:hanging="360"/>
@@ -7798,6 +7805,7 @@
     <w:name w:val="List 3"/>
     <w:basedOn w:val="1"/>
     <w:unhideWhenUsed/>
+    <w:qFormat/>
     <w:uiPriority w:val="99"/>
     <w:pPr>
       <w:ind w:left="1080" w:hanging="360"/>
@@ -7821,6 +7829,7 @@
     <w:name w:val="List Bullet 2"/>
     <w:basedOn w:val="1"/>
     <w:unhideWhenUsed/>
+    <w:qFormat/>
     <w:uiPriority w:val="99"/>
     <w:pPr>
       <w:numPr>
@@ -7869,6 +7878,7 @@
     <w:name w:val="List Continue 3"/>
     <w:basedOn w:val="1"/>
     <w:unhideWhenUsed/>
+    <w:qFormat/>
     <w:uiPriority w:val="99"/>
     <w:pPr>
       <w:spacing w:after="120"/>
@@ -7893,6 +7903,7 @@
     <w:name w:val="List Number 2"/>
     <w:basedOn w:val="1"/>
     <w:unhideWhenUsed/>
+    <w:qFormat/>
     <w:uiPriority w:val="99"/>
     <w:pPr>
       <w:numPr>
@@ -7906,6 +7917,7 @@
     <w:name w:val="List Number 3"/>
     <w:basedOn w:val="1"/>
     <w:unhideWhenUsed/>
+    <w:qFormat/>
     <w:uiPriority w:val="99"/>
     <w:pPr>
       <w:numPr>
@@ -7919,6 +7931,7 @@
     <w:name w:val="macro"/>
     <w:link w:val="149"/>
     <w:unhideWhenUsed/>
+    <w:qFormat/>
     <w:uiPriority w:val="99"/>
     <w:pPr>
       <w:tabs>
@@ -7974,6 +7987,7 @@
   <w:style w:type="table" w:styleId="35">
     <w:name w:val="Table Grid"/>
     <w:basedOn w:val="12"/>
+    <w:qFormat/>
     <w:uiPriority w:val="59"/>
     <w:pPr>
       <w:spacing w:after="0" w:line="240" w:lineRule="auto"/>
@@ -8032,6 +8046,7 @@
     <w:next w:val="1"/>
     <w:semiHidden/>
     <w:unhideWhenUsed/>
+    <w:qFormat/>
     <w:uiPriority w:val="39"/>
     <w:pPr>
       <w:ind w:left="420" w:leftChars="200"/>
@@ -8040,6 +8055,7 @@
   <w:style w:type="table" w:styleId="39">
     <w:name w:val="Light Shading"/>
     <w:basedOn w:val="12"/>
+    <w:qFormat/>
     <w:uiPriority w:val="60"/>
     <w:pPr>
       <w:spacing w:after="0" w:line="240" w:lineRule="auto"/>
@@ -8437,6 +8453,7 @@
   <w:style w:type="table" w:styleId="43">
     <w:name w:val="Light Shading Accent 4"/>
     <w:basedOn w:val="12"/>
+    <w:qFormat/>
     <w:uiPriority w:val="60"/>
     <w:pPr>
       <w:spacing w:after="0" w:line="240" w:lineRule="auto"/>
@@ -8536,6 +8553,7 @@
   <w:style w:type="table" w:styleId="44">
     <w:name w:val="Light Shading Accent 5"/>
     <w:basedOn w:val="12"/>
+    <w:qFormat/>
     <w:uiPriority w:val="60"/>
     <w:pPr>
       <w:spacing w:after="0" w:line="240" w:lineRule="auto"/>
@@ -8734,6 +8752,7 @@
   <w:style w:type="table" w:styleId="46">
     <w:name w:val="Light List"/>
     <w:basedOn w:val="12"/>
+    <w:qFormat/>
     <w:uiPriority w:val="61"/>
     <w:pPr>
       <w:spacing w:after="0" w:line="240" w:lineRule="auto"/>
@@ -8827,6 +8846,7 @@
   <w:style w:type="table" w:styleId="47">
     <w:name w:val="Light List Accent 1"/>
     <w:basedOn w:val="12"/>
+    <w:qFormat/>
     <w:uiPriority w:val="61"/>
     <w:pPr>
       <w:spacing w:after="0" w:line="240" w:lineRule="auto"/>
@@ -9106,6 +9126,7 @@
   <w:style w:type="table" w:styleId="50">
     <w:name w:val="Light List Accent 4"/>
     <w:basedOn w:val="12"/>
+    <w:qFormat/>
     <w:uiPriority w:val="61"/>
     <w:pPr>
       <w:spacing w:after="0" w:line="240" w:lineRule="auto"/>
@@ -9199,6 +9220,7 @@
   <w:style w:type="table" w:styleId="51">
     <w:name w:val="Light List Accent 5"/>
     <w:basedOn w:val="12"/>
+    <w:qFormat/>
     <w:uiPriority w:val="61"/>
     <w:pPr>
       <w:spacing w:after="0" w:line="240" w:lineRule="auto"/>
@@ -9385,6 +9407,7 @@
   <w:style w:type="table" w:styleId="53">
     <w:name w:val="Light Grid"/>
     <w:basedOn w:val="12"/>
+    <w:qFormat/>
     <w:uiPriority w:val="62"/>
     <w:pPr>
       <w:spacing w:after="0" w:line="240" w:lineRule="auto"/>
@@ -9637,6 +9660,7 @@
   <w:style w:type="table" w:styleId="55">
     <w:name w:val="Light Grid Accent 2"/>
     <w:basedOn w:val="12"/>
+    <w:qFormat/>
     <w:uiPriority w:val="62"/>
     <w:pPr>
       <w:spacing w:after="0" w:line="240" w:lineRule="auto"/>
@@ -10141,6 +10165,7 @@
   <w:style w:type="table" w:styleId="59">
     <w:name w:val="Light Grid Accent 6"/>
     <w:basedOn w:val="12"/>
+    <w:qFormat/>
     <w:uiPriority w:val="62"/>
     <w:pPr>
       <w:spacing w:after="0" w:line="240" w:lineRule="auto"/>
@@ -10695,6 +10720,7 @@
   <w:style w:type="table" w:styleId="64">
     <w:name w:val="Medium Shading 1 Accent 4"/>
     <w:basedOn w:val="12"/>
+    <w:qFormat/>
     <w:uiPriority w:val="63"/>
     <w:pPr>
       <w:spacing w:after="0" w:line="240" w:lineRule="auto"/>
@@ -12351,6 +12377,7 @@
   <w:style w:type="table" w:styleId="76">
     <w:name w:val="Medium List 1 Accent 2"/>
     <w:basedOn w:val="12"/>
+    <w:qFormat/>
     <w:uiPriority w:val="65"/>
     <w:pPr>
       <w:spacing w:after="0" w:line="240" w:lineRule="auto"/>
@@ -12441,6 +12468,7 @@
   <w:style w:type="table" w:styleId="77">
     <w:name w:val="Medium List 1 Accent 3"/>
     <w:basedOn w:val="12"/>
+    <w:qFormat/>
     <w:uiPriority w:val="65"/>
     <w:pPr>
       <w:spacing w:after="0" w:line="240" w:lineRule="auto"/>
@@ -12801,6 +12829,7 @@
   <w:style w:type="table" w:styleId="81">
     <w:name w:val="Medium List 2"/>
     <w:basedOn w:val="12"/>
+    <w:qFormat/>
     <w:uiPriority w:val="66"/>
     <w:pPr>
       <w:spacing w:after="0" w:line="240" w:lineRule="auto"/>
@@ -13059,6 +13088,7 @@
   <w:style w:type="table" w:styleId="83">
     <w:name w:val="Medium List 2 Accent 2"/>
     <w:basedOn w:val="12"/>
+    <w:qFormat/>
     <w:uiPriority w:val="66"/>
     <w:pPr>
       <w:spacing w:after="0" w:line="240" w:lineRule="auto"/>
@@ -13980,6 +14010,7 @@
   <w:style w:type="table" w:styleId="92">
     <w:name w:val="Medium Grid 1 Accent 4"/>
     <w:basedOn w:val="12"/>
+    <w:qFormat/>
     <w:uiPriority w:val="67"/>
     <w:pPr>
       <w:spacing w:after="0" w:line="240" w:lineRule="auto"/>
@@ -14187,6 +14218,7 @@
   <w:style w:type="table" w:styleId="95">
     <w:name w:val="Medium Grid 2"/>
     <w:basedOn w:val="12"/>
+    <w:qFormat/>
     <w:uiPriority w:val="68"/>
     <w:pPr>
       <w:spacing w:after="0" w:line="240" w:lineRule="auto"/>
@@ -14479,6 +14511,7 @@
   <w:style w:type="table" w:styleId="97">
     <w:name w:val="Medium Grid 2 Accent 2"/>
     <w:basedOn w:val="12"/>
+    <w:qFormat/>
     <w:uiPriority w:val="68"/>
     <w:pPr>
       <w:spacing w:after="0" w:line="240" w:lineRule="auto"/>
@@ -14917,6 +14950,7 @@
   <w:style w:type="table" w:styleId="100">
     <w:name w:val="Medium Grid 2 Accent 5"/>
     <w:basedOn w:val="12"/>
+    <w:qFormat/>
     <w:uiPriority w:val="68"/>
     <w:pPr>
       <w:spacing w:after="0" w:line="240" w:lineRule="auto"/>
@@ -15209,6 +15243,7 @@
   <w:style w:type="table" w:styleId="102">
     <w:name w:val="Medium Grid 3"/>
     <w:basedOn w:val="12"/>
+    <w:qFormat/>
     <w:uiPriority w:val="69"/>
     <w:pPr>
       <w:spacing w:after="0" w:line="240" w:lineRule="auto"/>
@@ -15366,6 +15401,7 @@
   <w:style w:type="table" w:styleId="103">
     <w:name w:val="Medium Grid 3 Accent 1"/>
     <w:basedOn w:val="12"/>
+    <w:qFormat/>
     <w:uiPriority w:val="69"/>
     <w:pPr>
       <w:spacing w:after="0" w:line="240" w:lineRule="auto"/>
@@ -15523,6 +15559,7 @@
   <w:style w:type="table" w:styleId="104">
     <w:name w:val="Medium Grid 3 Accent 2"/>
     <w:basedOn w:val="12"/>
+    <w:qFormat/>
     <w:uiPriority w:val="69"/>
     <w:pPr>
       <w:spacing w:after="0" w:line="240" w:lineRule="auto"/>
@@ -15680,6 +15717,7 @@
   <w:style w:type="table" w:styleId="105">
     <w:name w:val="Medium Grid 3 Accent 3"/>
     <w:basedOn w:val="12"/>
+    <w:qFormat/>
     <w:uiPriority w:val="69"/>
     <w:pPr>
       <w:spacing w:after="0" w:line="240" w:lineRule="auto"/>
@@ -15837,6 +15875,7 @@
   <w:style w:type="table" w:styleId="106">
     <w:name w:val="Medium Grid 3 Accent 4"/>
     <w:basedOn w:val="12"/>
+    <w:qFormat/>
     <w:uiPriority w:val="69"/>
     <w:pPr>
       <w:spacing w:after="0" w:line="240" w:lineRule="auto"/>
@@ -15994,6 +16033,7 @@
   <w:style w:type="table" w:styleId="107">
     <w:name w:val="Medium Grid 3 Accent 5"/>
     <w:basedOn w:val="12"/>
+    <w:qFormat/>
     <w:uiPriority w:val="69"/>
     <w:pPr>
       <w:spacing w:after="0" w:line="240" w:lineRule="auto"/>
@@ -16151,6 +16191,7 @@
   <w:style w:type="table" w:styleId="108">
     <w:name w:val="Medium Grid 3 Accent 6"/>
     <w:basedOn w:val="12"/>
+    <w:qFormat/>
     <w:uiPriority w:val="69"/>
     <w:pPr>
       <w:spacing w:after="0" w:line="240" w:lineRule="auto"/>
@@ -16308,6 +16349,7 @@
   <w:style w:type="table" w:styleId="109">
     <w:name w:val="Dark List"/>
     <w:basedOn w:val="12"/>
+    <w:qFormat/>
     <w:uiPriority w:val="70"/>
     <w:pPr>
       <w:spacing w:after="0" w:line="240" w:lineRule="auto"/>
@@ -16423,6 +16465,7 @@
   <w:style w:type="table" w:styleId="110">
     <w:name w:val="Dark List Accent 1"/>
     <w:basedOn w:val="12"/>
+    <w:qFormat/>
     <w:uiPriority w:val="70"/>
     <w:pPr>
       <w:spacing w:after="0" w:line="240" w:lineRule="auto"/>
@@ -16538,6 +16581,7 @@
   <w:style w:type="table" w:styleId="111">
     <w:name w:val="Dark List Accent 2"/>
     <w:basedOn w:val="12"/>
+    <w:qFormat/>
     <w:uiPriority w:val="70"/>
     <w:pPr>
       <w:spacing w:after="0" w:line="240" w:lineRule="auto"/>
@@ -16653,6 +16697,7 @@
   <w:style w:type="table" w:styleId="112">
     <w:name w:val="Dark List Accent 3"/>
     <w:basedOn w:val="12"/>
+    <w:qFormat/>
     <w:uiPriority w:val="70"/>
     <w:pPr>
       <w:spacing w:after="0" w:line="240" w:lineRule="auto"/>
@@ -16768,6 +16813,7 @@
   <w:style w:type="table" w:styleId="113">
     <w:name w:val="Dark List Accent 4"/>
     <w:basedOn w:val="12"/>
+    <w:qFormat/>
     <w:uiPriority w:val="70"/>
     <w:pPr>
       <w:spacing w:after="0" w:line="240" w:lineRule="auto"/>
@@ -16883,6 +16929,7 @@
   <w:style w:type="table" w:styleId="114">
     <w:name w:val="Dark List Accent 5"/>
     <w:basedOn w:val="12"/>
+    <w:qFormat/>
     <w:uiPriority w:val="70"/>
     <w:pPr>
       <w:spacing w:after="0" w:line="240" w:lineRule="auto"/>
@@ -16998,6 +17045,7 @@
   <w:style w:type="table" w:styleId="115">
     <w:name w:val="Dark List Accent 6"/>
     <w:basedOn w:val="12"/>
+    <w:qFormat/>
     <w:uiPriority w:val="70"/>
     <w:pPr>
       <w:spacing w:after="0" w:line="240" w:lineRule="auto"/>
@@ -17113,6 +17161,7 @@
   <w:style w:type="table" w:styleId="116">
     <w:name w:val="Colorful Shading"/>
     <w:basedOn w:val="12"/>
+    <w:qFormat/>
     <w:uiPriority w:val="71"/>
     <w:pPr>
       <w:spacing w:after="0" w:line="240" w:lineRule="auto"/>
@@ -17261,6 +17310,7 @@
   <w:style w:type="table" w:styleId="117">
     <w:name w:val="Colorful Shading Accent 1"/>
     <w:basedOn w:val="12"/>
+    <w:qFormat/>
     <w:uiPriority w:val="71"/>
     <w:pPr>
       <w:spacing w:after="0" w:line="240" w:lineRule="auto"/>
@@ -17409,6 +17459,7 @@
   <w:style w:type="table" w:styleId="118">
     <w:name w:val="Colorful Shading Accent 2"/>
     <w:basedOn w:val="12"/>
+    <w:qFormat/>
     <w:uiPriority w:val="71"/>
     <w:pPr>
       <w:spacing w:after="0" w:line="240" w:lineRule="auto"/>
@@ -17557,6 +17608,7 @@
   <w:style w:type="table" w:styleId="119">
     <w:name w:val="Colorful Shading Accent 3"/>
     <w:basedOn w:val="12"/>
+    <w:qFormat/>
     <w:uiPriority w:val="71"/>
     <w:pPr>
       <w:spacing w:after="0" w:line="240" w:lineRule="auto"/>
@@ -17685,6 +17737,7 @@
   <w:style w:type="table" w:styleId="120">
     <w:name w:val="Colorful Shading Accent 4"/>
     <w:basedOn w:val="12"/>
+    <w:qFormat/>
     <w:uiPriority w:val="71"/>
     <w:pPr>
       <w:spacing w:after="0" w:line="240" w:lineRule="auto"/>
@@ -18129,6 +18182,7 @@
   <w:style w:type="table" w:styleId="123">
     <w:name w:val="Colorful List"/>
     <w:basedOn w:val="12"/>
+    <w:qFormat/>
     <w:uiPriority w:val="72"/>
     <w:pPr>
       <w:spacing w:after="0" w:line="240" w:lineRule="auto"/>
@@ -18221,6 +18275,7 @@
   <w:style w:type="table" w:styleId="124">
     <w:name w:val="Colorful List Accent 1"/>
     <w:basedOn w:val="12"/>
+    <w:qFormat/>
     <w:uiPriority w:val="72"/>
     <w:pPr>
       <w:spacing w:after="0" w:line="240" w:lineRule="auto"/>
@@ -18405,6 +18460,7 @@
   <w:style w:type="table" w:styleId="126">
     <w:name w:val="Colorful List Accent 3"/>
     <w:basedOn w:val="12"/>
+    <w:qFormat/>
     <w:uiPriority w:val="72"/>
     <w:pPr>
       <w:spacing w:after="0" w:line="240" w:lineRule="auto"/>
@@ -18497,6 +18553,7 @@
   <w:style w:type="table" w:styleId="127">
     <w:name w:val="Colorful List Accent 4"/>
     <w:basedOn w:val="12"/>
+    <w:qFormat/>
     <w:uiPriority w:val="72"/>
     <w:pPr>
       <w:spacing w:after="0" w:line="240" w:lineRule="auto"/>
@@ -18589,6 +18646,7 @@
   <w:style w:type="table" w:styleId="128">
     <w:name w:val="Colorful List Accent 5"/>
     <w:basedOn w:val="12"/>
+    <w:qFormat/>
     <w:uiPriority w:val="72"/>
     <w:pPr>
       <w:spacing w:after="0" w:line="240" w:lineRule="auto"/>
@@ -18681,6 +18739,7 @@
   <w:style w:type="table" w:styleId="129">
     <w:name w:val="Colorful List Accent 6"/>
     <w:basedOn w:val="12"/>
+    <w:qFormat/>
     <w:uiPriority w:val="72"/>
     <w:pPr>
       <w:spacing w:after="0" w:line="240" w:lineRule="auto"/>
@@ -18773,6 +18832,7 @@
   <w:style w:type="table" w:styleId="130">
     <w:name w:val="Colorful Grid"/>
     <w:basedOn w:val="12"/>
+    <w:qFormat/>
     <w:uiPriority w:val="73"/>
     <w:pPr>
       <w:spacing w:after="0" w:line="240" w:lineRule="auto"/>
@@ -18869,6 +18929,7 @@
   <w:style w:type="table" w:styleId="131">
     <w:name w:val="Colorful Grid Accent 1"/>
     <w:basedOn w:val="12"/>
+    <w:qFormat/>
     <w:uiPriority w:val="73"/>
     <w:pPr>
       <w:spacing w:after="0" w:line="240" w:lineRule="auto"/>
@@ -18965,6 +19026,7 @@
   <w:style w:type="table" w:styleId="132">
     <w:name w:val="Colorful Grid Accent 2"/>
     <w:basedOn w:val="12"/>
+    <w:qFormat/>
     <w:uiPriority w:val="73"/>
     <w:pPr>
       <w:spacing w:after="0" w:line="240" w:lineRule="auto"/>
@@ -19061,6 +19123,7 @@
   <w:style w:type="table" w:styleId="133">
     <w:name w:val="Colorful Grid Accent 3"/>
     <w:basedOn w:val="12"/>
+    <w:qFormat/>
     <w:uiPriority w:val="73"/>
     <w:pPr>
       <w:spacing w:after="0" w:line="240" w:lineRule="auto"/>
@@ -19349,6 +19412,7 @@
   <w:style w:type="table" w:styleId="136">
     <w:name w:val="Colorful Grid Accent 6"/>
     <w:basedOn w:val="12"/>
+    <w:qFormat/>
     <w:uiPriority w:val="73"/>
     <w:pPr>
       <w:spacing w:after="0" w:line="240" w:lineRule="auto"/>
@@ -19453,6 +19517,7 @@
     <w:name w:val="Footer Char"/>
     <w:basedOn w:val="11"/>
     <w:link w:val="18"/>
+    <w:qFormat/>
     <w:uiPriority w:val="99"/>
   </w:style>
   <w:style w:type="paragraph" w:styleId="139">
@@ -19473,6 +19538,7 @@
     <w:name w:val="Heading 1 Char"/>
     <w:basedOn w:val="11"/>
     <w:link w:val="2"/>
+    <w:qFormat/>
     <w:uiPriority w:val="9"/>
     <w:rPr>
       <w:rFonts w:asciiTheme="majorHAnsi" w:hAnsiTheme="majorHAnsi" w:eastAsiaTheme="majorEastAsia" w:cstheme="majorBidi"/>
@@ -19487,6 +19553,7 @@
     <w:name w:val="Heading 2 Char"/>
     <w:basedOn w:val="11"/>
     <w:link w:val="3"/>
+    <w:qFormat/>
     <w:uiPriority w:val="9"/>
     <w:rPr>
       <w:rFonts w:asciiTheme="majorHAnsi" w:hAnsiTheme="majorHAnsi" w:eastAsiaTheme="majorEastAsia" w:cstheme="majorBidi"/>
@@ -19506,6 +19573,7 @@
     <w:name w:val="Heading 3 Char"/>
     <w:basedOn w:val="11"/>
     <w:link w:val="4"/>
+    <w:qFormat/>
     <w:uiPriority w:val="9"/>
     <w:rPr>
       <w:rFonts w:asciiTheme="majorHAnsi" w:hAnsiTheme="majorHAnsi" w:eastAsiaTheme="majorEastAsia" w:cstheme="majorBidi"/>
@@ -19523,6 +19591,7 @@
     <w:name w:val="Title Char"/>
     <w:basedOn w:val="11"/>
     <w:link w:val="36"/>
+    <w:qFormat/>
     <w:uiPriority w:val="10"/>
     <w:rPr>
       <w:rFonts w:asciiTheme="majorHAnsi" w:hAnsiTheme="majorHAnsi" w:eastAsiaTheme="majorEastAsia" w:cstheme="majorBidi"/>
@@ -19537,6 +19606,7 @@
     <w:name w:val="Subtitle Char"/>
     <w:basedOn w:val="11"/>
     <w:link w:val="34"/>
+    <w:qFormat/>
     <w:uiPriority w:val="11"/>
     <w:rPr>
       <w:rFonts w:asciiTheme="majorHAnsi" w:hAnsiTheme="majorHAnsi" w:eastAsiaTheme="majorEastAsia" w:cstheme="majorBidi"/>
@@ -19567,18 +19637,21 @@
     <w:name w:val="Body Text Char"/>
     <w:basedOn w:val="11"/>
     <w:link w:val="13"/>
+    <w:qFormat/>
     <w:uiPriority w:val="99"/>
   </w:style>
   <w:style w:type="character" w:customStyle="1" w:styleId="147">
     <w:name w:val="Body Text 2 Char"/>
     <w:basedOn w:val="11"/>
     <w:link w:val="14"/>
+    <w:qFormat/>
     <w:uiPriority w:val="99"/>
   </w:style>
   <w:style w:type="character" w:customStyle="1" w:styleId="148">
     <w:name w:val="Body Text 3 Char"/>
     <w:basedOn w:val="11"/>
     <w:link w:val="15"/>
+    <w:qFormat/>
     <w:uiPriority w:val="99"/>
     <w:rPr>
       <w:sz w:val="16"/>
@@ -19589,6 +19662,7 @@
     <w:name w:val="Macro Text Char"/>
     <w:basedOn w:val="11"/>
     <w:link w:val="32"/>
+    <w:qFormat/>
     <w:uiPriority w:val="99"/>
     <w:rPr>
       <w:rFonts w:ascii="Courier" w:hAnsi="Courier"/>
@@ -19618,6 +19692,7 @@
     <w:name w:val="Quote Char"/>
     <w:basedOn w:val="11"/>
     <w:link w:val="150"/>
+    <w:qFormat/>
     <w:uiPriority w:val="29"/>
     <w:rPr>
       <w:i/>
@@ -19635,6 +19710,7 @@
     <w:basedOn w:val="11"/>
     <w:link w:val="5"/>
     <w:semiHidden/>
+    <w:qFormat/>
     <w:uiPriority w:val="9"/>
     <w:rPr>
       <w:rFonts w:asciiTheme="majorHAnsi" w:hAnsiTheme="majorHAnsi" w:eastAsiaTheme="majorEastAsia" w:cstheme="majorBidi"/>
@@ -19655,6 +19731,7 @@
     <w:basedOn w:val="11"/>
     <w:link w:val="6"/>
     <w:semiHidden/>
+    <w:qFormat/>
     <w:uiPriority w:val="9"/>
     <w:rPr>
       <w:rFonts w:asciiTheme="majorHAnsi" w:hAnsiTheme="majorHAnsi" w:eastAsiaTheme="majorEastAsia" w:cstheme="majorBidi"/>
@@ -19666,6 +19743,7 @@
     <w:basedOn w:val="11"/>
     <w:link w:val="7"/>
     <w:semiHidden/>
+    <w:qFormat/>
     <w:uiPriority w:val="9"/>
     <w:rPr>
       <w:rFonts w:asciiTheme="majorHAnsi" w:hAnsiTheme="majorHAnsi" w:eastAsiaTheme="majorEastAsia" w:cstheme="majorBidi"/>
@@ -19679,6 +19757,7 @@
     <w:basedOn w:val="11"/>
     <w:link w:val="8"/>
     <w:semiHidden/>
+    <w:qFormat/>
     <w:uiPriority w:val="9"/>
     <w:rPr>
       <w:rFonts w:asciiTheme="majorHAnsi" w:hAnsiTheme="majorHAnsi" w:eastAsiaTheme="majorEastAsia" w:cstheme="majorBidi"/>
@@ -19700,6 +19779,7 @@
     <w:basedOn w:val="11"/>
     <w:link w:val="9"/>
     <w:semiHidden/>
+    <w:qFormat/>
     <w:uiPriority w:val="9"/>
     <w:rPr>
       <w:rFonts w:asciiTheme="majorHAnsi" w:hAnsiTheme="majorHAnsi" w:eastAsiaTheme="majorEastAsia" w:cstheme="majorBidi"/>
@@ -19718,6 +19798,7 @@
     <w:basedOn w:val="11"/>
     <w:link w:val="10"/>
     <w:semiHidden/>
+    <w:qFormat/>
     <w:uiPriority w:val="9"/>
     <w:rPr>
       <w:rFonts w:asciiTheme="majorHAnsi" w:hAnsiTheme="majorHAnsi" w:eastAsiaTheme="majorEastAsia" w:cstheme="majorBidi"/>
@@ -19767,6 +19848,7 @@
     <w:name w:val="Intense Quote Char"/>
     <w:basedOn w:val="11"/>
     <w:link w:val="158"/>
+    <w:qFormat/>
     <w:uiPriority w:val="30"/>
     <w:rPr>
       <w:b/>

</xml_diff>